<commit_message>
feat: 新增 action-recommendation PPTX + 修正舊客數據引用錯誤
- 新增威德行動建議 PPTX（3 頁：封面 / 一頁式整合 / 附來源版）
- 5 欄架構：守住舊客 / 搶回新客 / 開拓電商 / 深化回購 / 重構檔期
- 修正 Word + PPTX 中舊客行為描述：P4 品牌整體人均次 -6% 誤用為舊客數據
  實際舊客數據（P38）：人均次 +3%、單次金 +5%，行為穩健
- 更新 README 加入 PPTX 說明與版本紀錄

Co-Authored-By: Claude Opus 4.6 (1M context) <noreply@anthropic.com>
</commit_message>
<xml_diff>
--- a/威德益生菌_2512MAT/威德益生菌市場洞察分析報告摘要_invos.docx
+++ b/威德益生菌_2512MAT/威德益生菌市場洞察分析報告摘要_invos.docx
@@ -4864,7 +4864,7 @@
           <w:sz w:val="22"/>
           <w:szCs w:val="22"/>
         </w:rPr>
-        <w:t xml:space="preserve">重度買者：人均年購 4.5 次，年消費 &gt; NT$7,504，人流 +13% 但人均次 -4%、單次金 -5%，顯示購買行為趨向「集中少次」</w:t>
+        <w:t xml:space="preserve">重度買者：人均年購 4.5 次，年消費 &gt; NT$7,504，人數 +13% 但人均次 -4%、單次金 -5% — 這是市場整體數據，主因是中度買者升級進來拉低平均值，非代表個別重度買者行為變差</w:t>
       </w:r>
       <w:r>
         <w:rPr>
@@ -6642,7 +6642,7 @@
                 <w:sz w:val="24"/>
                 <w:szCs w:val="24"/>
               </w:rPr>
-              <w:t xml:space="preserve">洞察 4 「舊客撐盤假象」—— 舊客成長掩蓋結構性衰退訊號</w:t>
+              <w:t xml:space="preserve">洞察 4 「舊客撐盤」—— 品牌過度依賴單一客群，結構風險升高</w:t>
             </w:r>
           </w:p>
         </w:tc>
@@ -6690,7 +6690,7 @@
                 <w:sz w:val="22"/>
                 <w:szCs w:val="22"/>
               </w:rPr>
-              <w:t xml:space="preserve">威德既有買者人數 YoY +23%，銷額 +19%，是品牌唯一成長的客群，貢獻 57% 銷額。</w:t>
+              <w:t xml:space="preserve">威德既有買者人數 YoY +23%，銷額 +19%，是品牌唯一成長的客群，貢獻 57% 銷額。舊客行為穩健：人均次 +3%、單次金 +5%。</w:t>
             </w:r>
             <w:r>
               <w:rPr>
@@ -6714,7 +6714,7 @@
                 <w:sz w:val="22"/>
                 <w:szCs w:val="22"/>
               </w:rPr>
-              <w:t xml:space="preserve">但舊客行為正在質變：人均次數 -6%（1.5 次）、重度買者人均次 -12%（3.9 次），購買頻率全面下滑。</w:t>
+              <w:t xml:space="preserve">但品牌整體人均次 -6%（1.5 次），是被新客（人均次 -3%、單次金 -6%）和競品客（人均次 -6%、單次金 -5%）的大幅衰退拖累。</w:t>
             </w:r>
             <w:r>
               <w:rPr>
@@ -6725,7 +6725,7 @@
                 <w:sz w:val="18"/>
                 <w:szCs w:val="18"/>
               </w:rPr>
-              <w:t xml:space="preserve"> (P4, P60)</w:t>
+              <w:t xml:space="preserve"> (P4, P38)</w:t>
             </w:r>
           </w:p>
           <w:p>
@@ -6821,7 +6821,7 @@
                 <w:sz w:val="22"/>
                 <w:szCs w:val="22"/>
               </w:rPr>
-              <w:t xml:space="preserve">威德的「舊客成長」其實是倖存者偏差——留下來的人確實在買，但他們的購買頻率在下降，輕度用戶正在靜默流失。品牌銷額之所以只微跌 -2%，是因為舊客的「集中購買」（單次金 +2%）暫時撐住了場面。但一旦這批忠誠舊客的購買頻率繼續下滑，或開始嘗試善存等新選擇，品牌將沒有後備力量。</w:t>
+              <w:t xml:space="preserve">威德舊客的行為其實穩健——人均次 +3%、單次金 +5%，留下來的人買得更勤、花得更多。品牌整體人均次 -6% 是被新客（-3%）和競品客（-6%）的萎縮拖累。真正的風險不是舊客變差，而是品牌過度依賴舊客：新客/競品客持續萎縮，一旦舊客人數增長放緩或自然流失，品牌將沒有後備力量。</w:t>
             </w:r>
             <w:r>
               <w:rPr>
@@ -6832,7 +6832,7 @@
                 <w:sz w:val="18"/>
                 <w:szCs w:val="18"/>
               </w:rPr>
-              <w:t xml:space="preserve"> (P38, P60 + 推論)</w:t>
+              <w:t xml:space="preserve"> (P38 + 推論)</w:t>
             </w:r>
           </w:p>
           <w:p>
@@ -6845,7 +6845,7 @@
                 <w:sz w:val="22"/>
                 <w:szCs w:val="22"/>
               </w:rPr>
-              <w:t xml:space="preserve">更值得警惕的是：買者離開品類（直接不買益生菌）的比例遠高於流失至競品，意味著威德的產品可能沒有成功建立「持續補充」的消費習慣。</w:t>
+              <w:t xml:space="preserve">更值得警惕的是：買者離開品類（直接不買益生菌）的比例遠高於流失至競品，意味著威德需要在「品類需求維持」上加強經營，而不僅僅是防守競品搶客。</w:t>
             </w:r>
             <w:r>
               <w:rPr>

</xml_diff>